<commit_message>
Separa eroi, notifiche e dettaglio su rotte dedicate e raccoglie i servizi.
Co-authored-by: Cursor <cursoragent@cursor.com>
</commit_message>
<xml_diff>
--- a/Comandi-Angular.docx
+++ b/Comandi-Angular.docx
@@ -1910,6 +1910,7 @@
           <w:b/>
           <w:sz w:val="16"/>
         </w:rPr>
+        <w:lastRenderedPageBreak/>
         <w:t>ngIf (NgIf)</w:t>
       </w:r>
       <w:r>
@@ -3270,6 +3271,7 @@
           <w:b/>
           <w:sz w:val="16"/>
         </w:rPr>
+        <w:lastRenderedPageBreak/>
         <w:t>src/app/app.ts</w:t>
       </w:r>
       <w:r>
@@ -3870,6 +3872,150 @@
           <w:sz w:val="16"/>
         </w:rPr>
         <w:t>Un Observable non e un signal. Il signal tiene un valore attuale e la pagina lo legge con le parentesi. L Observable avvisa quando arriva qualcosa. Si possono usare insieme: nello subscribe chiami un signal.set con il valore arrivato.</w:t>
+      </w:r>
+    </w:p>
+    <w:p>
+      <w:pPr>
+        <w:spacing w:before="160" w:after="40" w:line="240" w:lineRule="auto"/>
+        <w:rPr>
+          <w:rFonts w:ascii="Calibri" w:hAnsi="Calibri" w:cs="Calibri"/>
+          <w:b/>
+        </w:rPr>
+      </w:pPr>
+      <w:r>
+        <w:rPr>
+          <w:rFonts w:ascii="Calibri" w:hAnsi="Calibri" w:cs="Calibri"/>
+          <w:b/>
+        </w:rPr>
+        <w:t>SUBSCRIBE E UNSUBSCRIBE</w:t>
+      </w:r>
+    </w:p>
+    <w:p>
+      <w:pPr>
+        <w:spacing w:after="20" w:line="240" w:lineRule="auto"/>
+        <w:rPr>
+          <w:rFonts w:ascii="Calibri" w:hAnsi="Calibri" w:cs="Calibri"/>
+          <w:sz w:val="16"/>
+        </w:rPr>
+      </w:pPr>
+      <w:r>
+        <w:rPr>
+          <w:rFonts w:ascii="Calibri" w:hAnsi="Calibri" w:cs="Calibri"/>
+          <w:sz w:val="16"/>
+        </w:rPr>
+        <w:t>Ogni subscribe va chiuso. Salva la sottoscrizione e in ngOnDestroy chiama unsubscribe. Se non lo fai, Angular continua ad ascoltare anche dopo che il componente e stato distrutto: la risposta arriva tardi e scrive su un componente che non c e piu. Restano ascolti appesi, memoria occupata e aggiornamenti su pagine gia uscite.</w:t>
+      </w:r>
+    </w:p>
+    <w:p>
+      <w:pPr>
+        <w:spacing w:before="20" w:after="0" w:line="240" w:lineRule="auto"/>
+        <w:rPr>
+          <w:rFonts w:ascii="Calibri" w:hAnsi="Calibri" w:cs="Calibri"/>
+          <w:sz w:val="16"/>
+        </w:rPr>
+      </w:pPr>
+      <w:r>
+        <w:rPr>
+          <w:rFonts w:ascii="Consolas" w:hAnsi="Consolas" w:cs="Calibri"/>
+          <w:b/>
+          <w:sz w:val="16"/>
+        </w:rPr>
+        <w:t>subscribe</w:t>
+      </w:r>
+      <w:r>
+        <w:rPr>
+          <w:rFonts w:ascii="Calibri" w:hAnsi="Calibri" w:cs="Calibri"/>
+          <w:sz w:val="16"/>
+        </w:rPr>
+        <w:t xml:space="preserve">  Parte l ascolto. Senza subscribe la chiamata HTTP non parte.</w:t>
+      </w:r>
+    </w:p>
+    <w:p>
+      <w:pPr>
+        <w:spacing w:before="20" w:after="0" w:line="240" w:lineRule="auto"/>
+        <w:rPr>
+          <w:rFonts w:ascii="Calibri" w:hAnsi="Calibri" w:cs="Calibri"/>
+          <w:sz w:val="16"/>
+        </w:rPr>
+      </w:pPr>
+      <w:r>
+        <w:rPr>
+          <w:rFonts w:ascii="Consolas" w:hAnsi="Consolas" w:cs="Calibri"/>
+          <w:b/>
+          <w:sz w:val="16"/>
+        </w:rPr>
+        <w:t>richiesta = ...subscribe</w:t>
+      </w:r>
+      <w:r>
+        <w:rPr>
+          <w:rFonts w:ascii="Calibri" w:hAnsi="Calibri" w:cs="Calibri"/>
+          <w:sz w:val="16"/>
+        </w:rPr>
+        <w:t xml:space="preserve">  Tieni da parte l oggetto Subscription.</w:t>
+      </w:r>
+    </w:p>
+    <w:p>
+      <w:pPr>
+        <w:spacing w:before="20" w:after="0" w:line="240" w:lineRule="auto"/>
+        <w:rPr>
+          <w:rFonts w:ascii="Calibri" w:hAnsi="Calibri" w:cs="Calibri"/>
+          <w:sz w:val="16"/>
+        </w:rPr>
+      </w:pPr>
+      <w:r>
+        <w:rPr>
+          <w:rFonts w:ascii="Consolas" w:hAnsi="Consolas" w:cs="Calibri"/>
+          <w:b/>
+          <w:sz w:val="16"/>
+        </w:rPr>
+        <w:t>ngOnDestroy</w:t>
+      </w:r>
+      <w:r>
+        <w:rPr>
+          <w:rFonts w:ascii="Calibri" w:hAnsi="Calibri" w:cs="Calibri"/>
+          <w:sz w:val="16"/>
+        </w:rPr>
+        <w:t xml:space="preserve">  Angular lo chiama quando toglie il componente dalla pagina.</w:t>
+      </w:r>
+    </w:p>
+    <w:p>
+      <w:pPr>
+        <w:spacing w:before="20" w:after="0" w:line="240" w:lineRule="auto"/>
+        <w:rPr>
+          <w:rFonts w:ascii="Calibri" w:hAnsi="Calibri" w:cs="Calibri"/>
+          <w:sz w:val="16"/>
+        </w:rPr>
+      </w:pPr>
+      <w:r>
+        <w:rPr>
+          <w:rFonts w:ascii="Consolas" w:hAnsi="Consolas" w:cs="Calibri"/>
+          <w:b/>
+          <w:sz w:val="16"/>
+        </w:rPr>
+        <w:t>richiesta.unsubscribe()</w:t>
+      </w:r>
+      <w:r>
+        <w:rPr>
+          <w:rFonts w:ascii="Calibri" w:hAnsi="Calibri" w:cs="Calibri"/>
+          <w:sz w:val="16"/>
+        </w:rPr>
+        <w:t xml:space="preserve">  Chiude l ascolto. Va messo in ngOnDestroy, ogni volta che hai fatto subscribe.</w:t>
+      </w:r>
+    </w:p>
+    <w:p>
+      <w:pPr>
+        <w:spacing w:after="20" w:line="240" w:lineRule="auto"/>
+        <w:rPr>
+          <w:rFonts w:ascii="Calibri" w:hAnsi="Calibri" w:cs="Calibri"/>
+          <w:sz w:val="16"/>
+        </w:rPr>
+      </w:pPr>
+      <w:r>
+        <w:rPr>
+          <w:rFonts w:ascii="Calibri" w:hAnsi="Calibri" w:cs="Calibri"/>
+          <w:sz w:val="16"/>
+        </w:rPr>
+        <w:t>Esempio: this.richiesta = this.eroeservizio.getEroi().subscribe(...). Poi ngOnDestroy chiama this.richiesta?.unsubscribe(). Vale per ogni Observable a cui ti iscrivi, non solo per gli eroi.</w:t>
       </w:r>
     </w:p>
     <w:p>

</xml_diff>